<commit_message>
update the project report
</commit_message>
<xml_diff>
--- a/Automation Test Report - Harsh Choudhary.docx
+++ b/Automation Test Report - Harsh Choudhary.docx
@@ -1955,6 +1955,7 @@
         <w:rPr>
           <w:b/>
           <w:bCs/>
+          <w:noProof/>
           <w:color w:val="4472C4" w:themeColor="accent1"/>
           <w:sz w:val="24"/>
           <w:szCs w:val="24"/>
@@ -2078,6 +2079,7 @@
         <w:rPr>
           <w:b/>
           <w:bCs/>
+          <w:noProof/>
           <w:color w:val="4472C4" w:themeColor="accent1"/>
           <w:sz w:val="24"/>
           <w:szCs w:val="24"/>
@@ -2133,6 +2135,7 @@
         <w:rPr>
           <w:b/>
           <w:bCs/>
+          <w:noProof/>
           <w:color w:val="4472C4" w:themeColor="accent1"/>
           <w:sz w:val="24"/>
           <w:szCs w:val="24"/>
@@ -2220,6 +2223,7 @@
         <w:rPr>
           <w:b/>
           <w:bCs/>
+          <w:noProof/>
           <w:color w:val="000000" w:themeColor="text1"/>
         </w:rPr>
         <w:drawing>
@@ -2271,6 +2275,7 @@
         <w:rPr>
           <w:b/>
           <w:bCs/>
+          <w:noProof/>
           <w:color w:val="000000" w:themeColor="text1"/>
         </w:rPr>
         <w:lastRenderedPageBreak/>
@@ -2357,6 +2362,7 @@
         <w:rPr>
           <w:b/>
           <w:bCs/>
+          <w:noProof/>
           <w:color w:val="000000" w:themeColor="text1"/>
         </w:rPr>
         <w:drawing>
@@ -2408,6 +2414,7 @@
         <w:rPr>
           <w:b/>
           <w:bCs/>
+          <w:noProof/>
           <w:color w:val="000000" w:themeColor="text1"/>
         </w:rPr>
         <w:lastRenderedPageBreak/>
@@ -2512,6 +2519,7 @@
         <w:rPr>
           <w:b/>
           <w:bCs/>
+          <w:noProof/>
           <w:color w:val="000000" w:themeColor="text1"/>
         </w:rPr>
         <w:drawing>
@@ -2572,6 +2580,7 @@
         <w:rPr>
           <w:b/>
           <w:bCs/>
+          <w:noProof/>
           <w:color w:val="000000" w:themeColor="text1"/>
         </w:rPr>
         <w:lastRenderedPageBreak/>
@@ -2694,6 +2703,7 @@
         <w:rPr>
           <w:b/>
           <w:bCs/>
+          <w:noProof/>
           <w:color w:val="000000" w:themeColor="text1"/>
         </w:rPr>
         <w:drawing>
@@ -2745,6 +2755,7 @@
         <w:rPr>
           <w:b/>
           <w:bCs/>
+          <w:noProof/>
           <w:color w:val="000000" w:themeColor="text1"/>
         </w:rPr>
         <w:lastRenderedPageBreak/>
@@ -2859,6 +2870,7 @@
         <w:rPr>
           <w:b/>
           <w:bCs/>
+          <w:noProof/>
           <w:color w:val="000000" w:themeColor="text1"/>
         </w:rPr>
         <w:drawing>
@@ -2910,6 +2922,7 @@
         <w:rPr>
           <w:b/>
           <w:bCs/>
+          <w:noProof/>
           <w:color w:val="000000" w:themeColor="text1"/>
         </w:rPr>
         <w:lastRenderedPageBreak/>
@@ -2997,6 +3010,7 @@
       </w:pPr>
       <w:r>
         <w:rPr>
+          <w:noProof/>
           <w:color w:val="000000" w:themeColor="text1"/>
           <w:sz w:val="24"/>
           <w:szCs w:val="24"/>
@@ -3049,6 +3063,7 @@
     </w:p>
     <w:p>
       <w:pPr>
+        <w:pStyle w:val="Heading2"/>
         <w:rPr>
           <w:b/>
           <w:bCs/>
@@ -3065,9 +3080,121 @@
           <w:sz w:val="24"/>
           <w:szCs w:val="24"/>
         </w:rPr>
-        <w:t>9</w:t>
-      </w:r>
-      <w:r>
+        <w:t>9. Project link &amp; Screenshots &amp; Evidence</w:t>
+      </w:r>
+    </w:p>
+    <w:p>
+      <w:r>
+        <w:t>Screenshots are captured automatically during execution and stored in the screenshots folder.</w:t>
+      </w:r>
+    </w:p>
+    <w:p>
+      <w:r>
+        <w:drawing>
+          <wp:inline distT="0" distB="0" distL="0" distR="0" wp14:anchorId="0ECC1867" wp14:editId="46D0E5FC">
+            <wp:extent cx="2962688" cy="752580"/>
+            <wp:effectExtent l="0" t="0" r="9525" b="9525"/>
+            <wp:docPr id="2109369079" name="Picture 1"/>
+            <wp:cNvGraphicFramePr>
+              <a:graphicFrameLocks xmlns:a="http://schemas.openxmlformats.org/drawingml/2006/main" noChangeAspect="1"/>
+            </wp:cNvGraphicFramePr>
+            <a:graphic xmlns:a="http://schemas.openxmlformats.org/drawingml/2006/main">
+              <a:graphicData uri="http://schemas.openxmlformats.org/drawingml/2006/picture">
+                <pic:pic xmlns:pic="http://schemas.openxmlformats.org/drawingml/2006/picture">
+                  <pic:nvPicPr>
+                    <pic:cNvPr id="2109369079" name=""/>
+                    <pic:cNvPicPr/>
+                  </pic:nvPicPr>
+                  <pic:blipFill>
+                    <a:blip r:embed="rId22"/>
+                    <a:stretch>
+                      <a:fillRect/>
+                    </a:stretch>
+                  </pic:blipFill>
+                  <pic:spPr>
+                    <a:xfrm>
+                      <a:off x="0" y="0"/>
+                      <a:ext cx="2962688" cy="752580"/>
+                    </a:xfrm>
+                    <a:prstGeom prst="rect">
+                      <a:avLst/>
+                    </a:prstGeom>
+                  </pic:spPr>
+                </pic:pic>
+              </a:graphicData>
+            </a:graphic>
+          </wp:inline>
+        </w:drawing>
+      </w:r>
+    </w:p>
+    <w:p/>
+    <w:p>
+      <w:r>
+        <w:lastRenderedPageBreak/>
+        <w:t>Command –</w:t>
+      </w:r>
+      <w:proofErr w:type="spellStart"/>
+      <w:r>
+        <w:t>mvn</w:t>
+      </w:r>
+      <w:proofErr w:type="spellEnd"/>
+      <w:r>
+        <w:t xml:space="preserve"> clean test </w:t>
+      </w:r>
+    </w:p>
+    <w:p>
+      <w:r>
+        <w:rPr>
+          <w:noProof/>
+        </w:rPr>
+        <w:drawing>
+          <wp:inline distT="0" distB="0" distL="0" distR="0" wp14:anchorId="739D9D16" wp14:editId="2C7A6E8F">
+            <wp:extent cx="5731510" cy="1497330"/>
+            <wp:effectExtent l="0" t="0" r="2540" b="7620"/>
+            <wp:docPr id="1215519424" name="Picture 1"/>
+            <wp:cNvGraphicFramePr>
+              <a:graphicFrameLocks xmlns:a="http://schemas.openxmlformats.org/drawingml/2006/main" noChangeAspect="1"/>
+            </wp:cNvGraphicFramePr>
+            <a:graphic xmlns:a="http://schemas.openxmlformats.org/drawingml/2006/main">
+              <a:graphicData uri="http://schemas.openxmlformats.org/drawingml/2006/picture">
+                <pic:pic xmlns:pic="http://schemas.openxmlformats.org/drawingml/2006/picture">
+                  <pic:nvPicPr>
+                    <pic:cNvPr id="1215519424" name=""/>
+                    <pic:cNvPicPr/>
+                  </pic:nvPicPr>
+                  <pic:blipFill>
+                    <a:blip r:embed="rId23"/>
+                    <a:stretch>
+                      <a:fillRect/>
+                    </a:stretch>
+                  </pic:blipFill>
+                  <pic:spPr>
+                    <a:xfrm>
+                      <a:off x="0" y="0"/>
+                      <a:ext cx="5731510" cy="1497330"/>
+                    </a:xfrm>
+                    <a:prstGeom prst="rect">
+                      <a:avLst/>
+                    </a:prstGeom>
+                  </pic:spPr>
+                </pic:pic>
+              </a:graphicData>
+            </a:graphic>
+          </wp:inline>
+        </w:drawing>
+      </w:r>
+    </w:p>
+    <w:p>
+      <w:pPr>
+        <w:rPr>
+          <w:b/>
+          <w:bCs/>
+          <w:color w:val="000000" w:themeColor="text1"/>
+        </w:rPr>
+      </w:pPr>
+    </w:p>
+    <w:p>
+      <w:pPr>
         <w:rPr>
           <w:b/>
           <w:bCs/>
@@ -3075,19 +3202,38 @@
           <w:sz w:val="24"/>
           <w:szCs w:val="24"/>
         </w:rPr>
+      </w:pPr>
+      <w:r>
+        <w:rPr>
+          <w:b/>
+          <w:bCs/>
+          <w:color w:val="4472C4" w:themeColor="accent1"/>
+          <w:sz w:val="24"/>
+          <w:szCs w:val="24"/>
+        </w:rPr>
+        <w:t>10</w:t>
+      </w:r>
+      <w:r>
+        <w:rPr>
+          <w:b/>
+          <w:bCs/>
+          <w:color w:val="4472C4" w:themeColor="accent1"/>
+          <w:sz w:val="24"/>
+          <w:szCs w:val="24"/>
+        </w:rPr>
         <w:t>. CI/CD &amp; Containerization</w:t>
       </w:r>
     </w:p>
     <w:p>
       <w:r>
-        <w:t>The framework is completely environment-agnostic.</w:t>
+        <w:t>The framework is highly portable and environment-agnostic, achieving zero-dependency execution through containerization and CI/CD pipelines.</w:t>
       </w:r>
     </w:p>
     <w:p>
       <w:pPr>
         <w:numPr>
           <w:ilvl w:val="0"/>
-          <w:numId w:val="6"/>
+          <w:numId w:val="10"/>
         </w:numPr>
       </w:pPr>
       <w:r>
@@ -3095,7 +3241,33 @@
           <w:b/>
           <w:bCs/>
         </w:rPr>
-        <w:t>Jenkins:</w:t>
+        <w:t>Docker (Containerization):</w:t>
+      </w:r>
+      <w:r>
+        <w:t xml:space="preserve"> Containerized the entire automation suite using a custom </w:t>
+      </w:r>
+      <w:proofErr w:type="spellStart"/>
+      <w:r>
+        <w:t>Dockerfile</w:t>
+      </w:r>
+      <w:proofErr w:type="spellEnd"/>
+      <w:r>
+        <w:t>. Leveraged the selenium/standalone-chrome base image and injected JDK/Maven dependencies to create a fully isolated execution environment. The tests run seamlessly inside the container without requiring local browser installations.</w:t>
+      </w:r>
+    </w:p>
+    <w:p>
+      <w:pPr>
+        <w:numPr>
+          <w:ilvl w:val="0"/>
+          <w:numId w:val="10"/>
+        </w:numPr>
+      </w:pPr>
+      <w:r>
+        <w:rPr>
+          <w:b/>
+          <w:bCs/>
+        </w:rPr>
+        <w:t>Jenkins (CI/CD):</w:t>
       </w:r>
       <w:r>
         <w:t xml:space="preserve"> Configured a declarative </w:t>
@@ -3106,15 +3278,46 @@
       </w:r>
       <w:proofErr w:type="spellEnd"/>
       <w:r>
-        <w:t xml:space="preserve"> pipeline that automatically checks out code, compiles, executes the maven-surefire-plugin (with </w:t>
-      </w:r>
-      <w:proofErr w:type="spellStart"/>
-      <w:r>
-        <w:t>testFailureIgnore</w:t>
-      </w:r>
-      <w:proofErr w:type="spellEnd"/>
-      <w:r>
-        <w:t xml:space="preserve">=true), and archives Extent Reports upon completion. </w:t>
+        <w:t xml:space="preserve"> pipeline that orchestrates the entire workflow: automatically checking out code from GitHub, compiling the framework, running the TestNG suite natively, building the Docker image (docker build), executing tests inside the isolated container (docker run), and archiving Extent Reports as build artifacts.</w:t>
+      </w:r>
+    </w:p>
+    <w:p>
+      <w:r>
+        <w:drawing>
+          <wp:inline distT="0" distB="0" distL="0" distR="0" wp14:anchorId="46DA7683" wp14:editId="5222D88D">
+            <wp:extent cx="5731510" cy="1559560"/>
+            <wp:effectExtent l="0" t="0" r="2540" b="2540"/>
+            <wp:docPr id="1388886866" name="Picture 1"/>
+            <wp:cNvGraphicFramePr>
+              <a:graphicFrameLocks xmlns:a="http://schemas.openxmlformats.org/drawingml/2006/main" noChangeAspect="1"/>
+            </wp:cNvGraphicFramePr>
+            <a:graphic xmlns:a="http://schemas.openxmlformats.org/drawingml/2006/main">
+              <a:graphicData uri="http://schemas.openxmlformats.org/drawingml/2006/picture">
+                <pic:pic xmlns:pic="http://schemas.openxmlformats.org/drawingml/2006/picture">
+                  <pic:nvPicPr>
+                    <pic:cNvPr id="1388886866" name=""/>
+                    <pic:cNvPicPr/>
+                  </pic:nvPicPr>
+                  <pic:blipFill>
+                    <a:blip r:embed="rId24"/>
+                    <a:stretch>
+                      <a:fillRect/>
+                    </a:stretch>
+                  </pic:blipFill>
+                  <pic:spPr>
+                    <a:xfrm>
+                      <a:off x="0" y="0"/>
+                      <a:ext cx="5731510" cy="1559560"/>
+                    </a:xfrm>
+                    <a:prstGeom prst="rect">
+                      <a:avLst/>
+                    </a:prstGeom>
+                  </pic:spPr>
+                </pic:pic>
+              </a:graphicData>
+            </a:graphic>
+          </wp:inline>
+        </w:drawing>
       </w:r>
     </w:p>
     <w:p>
@@ -3146,8 +3349,17 @@
           <w:sz w:val="24"/>
           <w:szCs w:val="24"/>
         </w:rPr>
-        <w:lastRenderedPageBreak/>
-        <w:t>10</w:t>
+        <w:t>1</w:t>
+      </w:r>
+      <w:r>
+        <w:rPr>
+          <w:b/>
+          <w:bCs/>
+          <w:color w:val="4472C4" w:themeColor="accent1"/>
+          <w:sz w:val="24"/>
+          <w:szCs w:val="24"/>
+        </w:rPr>
+        <w:t>1</w:t>
       </w:r>
       <w:r>
         <w:rPr>
@@ -3949,7 +4161,7 @@
   <w:abstractNum w:abstractNumId="6" w15:restartNumberingAfterBreak="0">
     <w:nsid w:val="633E0450"/>
     <w:multiLevelType w:val="multilevel"/>
-    <w:tmpl w:val="1E062D04"/>
+    <w:tmpl w:val="877E937A"/>
     <w:lvl w:ilvl="0">
       <w:start w:val="1"/>
       <w:numFmt w:val="bullet"/>
@@ -3966,20 +4178,16 @@
         <w:sz w:val="20"/>
       </w:rPr>
     </w:lvl>
-    <w:lvl w:ilvl="1" w:tentative="1">
-      <w:start w:val="1"/>
-      <w:numFmt w:val="bullet"/>
-      <w:lvlText w:val="o"/>
-      <w:lvlJc w:val="left"/>
-      <w:pPr>
-        <w:tabs>
-          <w:tab w:val="num" w:pos="1440"/>
-        </w:tabs>
+    <w:lvl w:ilvl="1">
+      <w:start w:val="9"/>
+      <w:numFmt w:val="bullet"/>
+      <w:lvlText w:val="-"/>
+      <w:lvlJc w:val="left"/>
+      <w:pPr>
         <w:ind w:left="1440" w:hanging="360"/>
       </w:pPr>
       <w:rPr>
-        <w:rFonts w:ascii="Courier New" w:hAnsi="Courier New" w:hint="default"/>
-        <w:sz w:val="20"/>
+        <w:rFonts w:ascii="Calibri" w:eastAsiaTheme="minorHAnsi" w:hAnsi="Calibri" w:cs="Calibri" w:hint="default"/>
       </w:rPr>
     </w:lvl>
     <w:lvl w:ilvl="2" w:tentative="1">
@@ -4212,6 +4420,155 @@
     <w:nsid w:val="784F4244"/>
     <w:multiLevelType w:val="multilevel"/>
     <w:tmpl w:val="D5C21C14"/>
+    <w:lvl w:ilvl="0">
+      <w:start w:val="1"/>
+      <w:numFmt w:val="bullet"/>
+      <w:lvlText w:val=""/>
+      <w:lvlJc w:val="left"/>
+      <w:pPr>
+        <w:tabs>
+          <w:tab w:val="num" w:pos="720"/>
+        </w:tabs>
+        <w:ind w:left="720" w:hanging="360"/>
+      </w:pPr>
+      <w:rPr>
+        <w:rFonts w:ascii="Symbol" w:hAnsi="Symbol" w:hint="default"/>
+        <w:sz w:val="20"/>
+      </w:rPr>
+    </w:lvl>
+    <w:lvl w:ilvl="1" w:tentative="1">
+      <w:start w:val="1"/>
+      <w:numFmt w:val="bullet"/>
+      <w:lvlText w:val="o"/>
+      <w:lvlJc w:val="left"/>
+      <w:pPr>
+        <w:tabs>
+          <w:tab w:val="num" w:pos="1440"/>
+        </w:tabs>
+        <w:ind w:left="1440" w:hanging="360"/>
+      </w:pPr>
+      <w:rPr>
+        <w:rFonts w:ascii="Courier New" w:hAnsi="Courier New" w:hint="default"/>
+        <w:sz w:val="20"/>
+      </w:rPr>
+    </w:lvl>
+    <w:lvl w:ilvl="2" w:tentative="1">
+      <w:start w:val="1"/>
+      <w:numFmt w:val="bullet"/>
+      <w:lvlText w:val=""/>
+      <w:lvlJc w:val="left"/>
+      <w:pPr>
+        <w:tabs>
+          <w:tab w:val="num" w:pos="2160"/>
+        </w:tabs>
+        <w:ind w:left="2160" w:hanging="360"/>
+      </w:pPr>
+      <w:rPr>
+        <w:rFonts w:ascii="Wingdings" w:hAnsi="Wingdings" w:hint="default"/>
+        <w:sz w:val="20"/>
+      </w:rPr>
+    </w:lvl>
+    <w:lvl w:ilvl="3" w:tentative="1">
+      <w:start w:val="1"/>
+      <w:numFmt w:val="bullet"/>
+      <w:lvlText w:val=""/>
+      <w:lvlJc w:val="left"/>
+      <w:pPr>
+        <w:tabs>
+          <w:tab w:val="num" w:pos="2880"/>
+        </w:tabs>
+        <w:ind w:left="2880" w:hanging="360"/>
+      </w:pPr>
+      <w:rPr>
+        <w:rFonts w:ascii="Wingdings" w:hAnsi="Wingdings" w:hint="default"/>
+        <w:sz w:val="20"/>
+      </w:rPr>
+    </w:lvl>
+    <w:lvl w:ilvl="4" w:tentative="1">
+      <w:start w:val="1"/>
+      <w:numFmt w:val="bullet"/>
+      <w:lvlText w:val=""/>
+      <w:lvlJc w:val="left"/>
+      <w:pPr>
+        <w:tabs>
+          <w:tab w:val="num" w:pos="3600"/>
+        </w:tabs>
+        <w:ind w:left="3600" w:hanging="360"/>
+      </w:pPr>
+      <w:rPr>
+        <w:rFonts w:ascii="Wingdings" w:hAnsi="Wingdings" w:hint="default"/>
+        <w:sz w:val="20"/>
+      </w:rPr>
+    </w:lvl>
+    <w:lvl w:ilvl="5" w:tentative="1">
+      <w:start w:val="1"/>
+      <w:numFmt w:val="bullet"/>
+      <w:lvlText w:val=""/>
+      <w:lvlJc w:val="left"/>
+      <w:pPr>
+        <w:tabs>
+          <w:tab w:val="num" w:pos="4320"/>
+        </w:tabs>
+        <w:ind w:left="4320" w:hanging="360"/>
+      </w:pPr>
+      <w:rPr>
+        <w:rFonts w:ascii="Wingdings" w:hAnsi="Wingdings" w:hint="default"/>
+        <w:sz w:val="20"/>
+      </w:rPr>
+    </w:lvl>
+    <w:lvl w:ilvl="6" w:tentative="1">
+      <w:start w:val="1"/>
+      <w:numFmt w:val="bullet"/>
+      <w:lvlText w:val=""/>
+      <w:lvlJc w:val="left"/>
+      <w:pPr>
+        <w:tabs>
+          <w:tab w:val="num" w:pos="5040"/>
+        </w:tabs>
+        <w:ind w:left="5040" w:hanging="360"/>
+      </w:pPr>
+      <w:rPr>
+        <w:rFonts w:ascii="Wingdings" w:hAnsi="Wingdings" w:hint="default"/>
+        <w:sz w:val="20"/>
+      </w:rPr>
+    </w:lvl>
+    <w:lvl w:ilvl="7" w:tentative="1">
+      <w:start w:val="1"/>
+      <w:numFmt w:val="bullet"/>
+      <w:lvlText w:val=""/>
+      <w:lvlJc w:val="left"/>
+      <w:pPr>
+        <w:tabs>
+          <w:tab w:val="num" w:pos="5760"/>
+        </w:tabs>
+        <w:ind w:left="5760" w:hanging="360"/>
+      </w:pPr>
+      <w:rPr>
+        <w:rFonts w:ascii="Wingdings" w:hAnsi="Wingdings" w:hint="default"/>
+        <w:sz w:val="20"/>
+      </w:rPr>
+    </w:lvl>
+    <w:lvl w:ilvl="8" w:tentative="1">
+      <w:start w:val="1"/>
+      <w:numFmt w:val="bullet"/>
+      <w:lvlText w:val=""/>
+      <w:lvlJc w:val="left"/>
+      <w:pPr>
+        <w:tabs>
+          <w:tab w:val="num" w:pos="6480"/>
+        </w:tabs>
+        <w:ind w:left="6480" w:hanging="360"/>
+      </w:pPr>
+      <w:rPr>
+        <w:rFonts w:ascii="Wingdings" w:hAnsi="Wingdings" w:hint="default"/>
+        <w:sz w:val="20"/>
+      </w:rPr>
+    </w:lvl>
+  </w:abstractNum>
+  <w:abstractNum w:abstractNumId="9" w15:restartNumberingAfterBreak="0">
+    <w:nsid w:val="7BC919F4"/>
+    <w:multiLevelType w:val="multilevel"/>
+    <w:tmpl w:val="BBBCC9D2"/>
     <w:lvl w:ilvl="0">
       <w:start w:val="1"/>
       <w:numFmt w:val="bullet"/>
@@ -4383,6 +4740,9 @@
   </w:num>
   <w:num w:numId="9" w16cid:durableId="1586961951">
     <w:abstractNumId w:val="0"/>
+  </w:num>
+  <w:num w:numId="10" w16cid:durableId="2112819928">
+    <w:abstractNumId w:val="9"/>
   </w:num>
 </w:numbering>
 </file>
@@ -4816,7 +5176,6 @@
     <w:next w:val="Normal"/>
     <w:link w:val="Heading2Char"/>
     <w:uiPriority w:val="9"/>
-    <w:semiHidden/>
     <w:unhideWhenUsed/>
     <w:qFormat/>
     <w:rsid w:val="006D0919"/>
@@ -5031,7 +5390,6 @@
     <w:basedOn w:val="DefaultParagraphFont"/>
     <w:link w:val="Heading2"/>
     <w:uiPriority w:val="9"/>
-    <w:semiHidden/>
     <w:rsid w:val="006D0919"/>
     <w:rPr>
       <w:rFonts w:asciiTheme="majorHAnsi" w:eastAsiaTheme="majorEastAsia" w:hAnsiTheme="majorHAnsi" w:cstheme="majorBidi"/>

</xml_diff>

<commit_message>
update the report file
</commit_message>
<xml_diff>
--- a/Automation Test Report - Harsh Choudhary.docx
+++ b/Automation Test Report - Harsh Choudhary.docx
@@ -21,60 +21,38 @@
           <w:sz w:val="32"/>
           <w:szCs w:val="32"/>
         </w:rPr>
-        <w:t xml:space="preserve">Automation Test Report - </w:t>
+        <w:t>Automation Test Report - BlazeDemo Flight Booking Project</w:t>
+      </w:r>
+    </w:p>
+    <w:p>
+      <w:r>
+        <w:rPr>
+          <w:b/>
+          <w:bCs/>
+        </w:rPr>
+        <w:t>Prepared By:</w:t>
+      </w:r>
+      <w:r>
+        <w:t xml:space="preserve"> Harsh Choudhary </w:t>
+      </w:r>
+    </w:p>
+    <w:p>
+      <w:r>
+        <w:rPr>
+          <w:b/>
+          <w:bCs/>
+        </w:rPr>
+        <w:t>Framework:</w:t>
+      </w:r>
+      <w:r>
+        <w:t xml:space="preserve"> Selenium + Java + TestNG + Maven + Page Object Model (POM) + </w:t>
       </w:r>
       <w:proofErr w:type="spellStart"/>
       <w:r>
-        <w:rPr>
-          <w:b/>
-          <w:bCs/>
-          <w:color w:val="002060"/>
-          <w:sz w:val="32"/>
-          <w:szCs w:val="32"/>
-        </w:rPr>
-        <w:t>BlazeDemo</w:t>
+        <w:t>ThreadLocal</w:t>
       </w:r>
       <w:proofErr w:type="spellEnd"/>
       <w:r>
-        <w:rPr>
-          <w:b/>
-          <w:bCs/>
-          <w:color w:val="002060"/>
-          <w:sz w:val="32"/>
-          <w:szCs w:val="32"/>
-        </w:rPr>
-        <w:t xml:space="preserve"> Flight Booking Project</w:t>
-      </w:r>
-    </w:p>
-    <w:p>
-      <w:r>
-        <w:rPr>
-          <w:b/>
-          <w:bCs/>
-        </w:rPr>
-        <w:t>Prepared By:</w:t>
-      </w:r>
-      <w:r>
-        <w:t xml:space="preserve"> Harsh Choudhary </w:t>
-      </w:r>
-    </w:p>
-    <w:p>
-      <w:r>
-        <w:rPr>
-          <w:b/>
-          <w:bCs/>
-        </w:rPr>
-        <w:t>Framework:</w:t>
-      </w:r>
-      <w:r>
-        <w:t xml:space="preserve"> Selenium + Java + TestNG + Maven + Page Object Model (POM) + </w:t>
-      </w:r>
-      <w:proofErr w:type="spellStart"/>
-      <w:r>
-        <w:t>ThreadLocal</w:t>
-      </w:r>
-      <w:proofErr w:type="spellEnd"/>
-      <w:r>
         <w:t xml:space="preserve"> </w:t>
       </w:r>
     </w:p>
@@ -113,15 +91,7 @@
     </w:p>
     <w:p>
       <w:r>
-        <w:t xml:space="preserve">This project automates the </w:t>
-      </w:r>
-      <w:proofErr w:type="spellStart"/>
-      <w:r>
-        <w:t>BlazeDemo</w:t>
-      </w:r>
-      <w:proofErr w:type="spellEnd"/>
-      <w:r>
-        <w:t xml:space="preserve"> Flight Booking application using an Enterprise-Grade Selenium WebDriver framework. Built on the Page Object Model (POM) design pattern, the framework achieves high maintainability and clean separation of concerns. Unlike basic setups, this architecture integrates </w:t>
+        <w:t xml:space="preserve">This project automates the BlazeDemo Flight Booking application using an Enterprise-Grade Selenium WebDriver framework. Built on the Page Object Model (POM) design pattern, the framework achieves high maintainability and clean separation of concerns. Unlike basic setups, this architecture integrates </w:t>
       </w:r>
       <w:proofErr w:type="spellStart"/>
       <w:r>
@@ -480,15 +450,7 @@
         </w:numPr>
       </w:pPr>
       <w:r>
-        <w:t xml:space="preserve">Launch </w:t>
-      </w:r>
-      <w:proofErr w:type="spellStart"/>
-      <w:r>
-        <w:t>BlazeDemo</w:t>
-      </w:r>
-      <w:proofErr w:type="spellEnd"/>
-      <w:r>
-        <w:t xml:space="preserve"> Application via Config URL. </w:t>
+        <w:t xml:space="preserve">Launch BlazeDemo Application via Config URL. </w:t>
       </w:r>
     </w:p>
     <w:p>
@@ -3090,6 +3052,9 @@
     </w:p>
     <w:p>
       <w:r>
+        <w:rPr>
+          <w:noProof/>
+        </w:rPr>
         <w:drawing>
           <wp:inline distT="0" distB="0" distL="0" distR="0" wp14:anchorId="0ECC1867" wp14:editId="46D0E5FC">
             <wp:extent cx="2962688" cy="752580"/>
@@ -3129,6 +3094,111 @@
     </w:p>
     <w:p/>
     <w:p>
+      <w:pPr>
+        <w:rPr>
+          <w:color w:val="2F5496" w:themeColor="accent1" w:themeShade="BF"/>
+        </w:rPr>
+      </w:pPr>
+      <w:r>
+        <w:rPr>
+          <w:color w:val="2F5496" w:themeColor="accent1" w:themeShade="BF"/>
+        </w:rPr>
+        <w:lastRenderedPageBreak/>
+        <w:t>Run as TestNG Suite in IDE</w:t>
+      </w:r>
+      <w:r>
+        <w:rPr>
+          <w:color w:val="2F5496" w:themeColor="accent1" w:themeShade="BF"/>
+        </w:rPr>
+        <w:t>:</w:t>
+      </w:r>
+    </w:p>
+    <w:p>
+      <w:r>
+        <w:rPr>
+          <w:noProof/>
+        </w:rPr>
+        <w:drawing>
+          <wp:inline distT="0" distB="0" distL="0" distR="0" wp14:anchorId="7A86C0EF" wp14:editId="39DCCB16">
+            <wp:extent cx="5731510" cy="4455160"/>
+            <wp:effectExtent l="0" t="0" r="2540" b="2540"/>
+            <wp:docPr id="1040441169" name="Picture 1"/>
+            <wp:cNvGraphicFramePr>
+              <a:graphicFrameLocks xmlns:a="http://schemas.openxmlformats.org/drawingml/2006/main" noChangeAspect="1"/>
+            </wp:cNvGraphicFramePr>
+            <a:graphic xmlns:a="http://schemas.openxmlformats.org/drawingml/2006/main">
+              <a:graphicData uri="http://schemas.openxmlformats.org/drawingml/2006/picture">
+                <pic:pic xmlns:pic="http://schemas.openxmlformats.org/drawingml/2006/picture">
+                  <pic:nvPicPr>
+                    <pic:cNvPr id="1040441169" name=""/>
+                    <pic:cNvPicPr/>
+                  </pic:nvPicPr>
+                  <pic:blipFill>
+                    <a:blip r:embed="rId23"/>
+                    <a:stretch>
+                      <a:fillRect/>
+                    </a:stretch>
+                  </pic:blipFill>
+                  <pic:spPr>
+                    <a:xfrm>
+                      <a:off x="0" y="0"/>
+                      <a:ext cx="5731510" cy="4455160"/>
+                    </a:xfrm>
+                    <a:prstGeom prst="rect">
+                      <a:avLst/>
+                    </a:prstGeom>
+                  </pic:spPr>
+                </pic:pic>
+              </a:graphicData>
+            </a:graphic>
+          </wp:inline>
+        </w:drawing>
+      </w:r>
+    </w:p>
+    <w:p>
+      <w:r>
+        <w:rPr>
+          <w:noProof/>
+        </w:rPr>
+        <w:drawing>
+          <wp:inline distT="0" distB="0" distL="0" distR="0" wp14:anchorId="50CE16DF" wp14:editId="56E666F6">
+            <wp:extent cx="5731510" cy="3696335"/>
+            <wp:effectExtent l="0" t="0" r="2540" b="0"/>
+            <wp:docPr id="1872645524" name="Picture 1"/>
+            <wp:cNvGraphicFramePr>
+              <a:graphicFrameLocks xmlns:a="http://schemas.openxmlformats.org/drawingml/2006/main" noChangeAspect="1"/>
+            </wp:cNvGraphicFramePr>
+            <a:graphic xmlns:a="http://schemas.openxmlformats.org/drawingml/2006/main">
+              <a:graphicData uri="http://schemas.openxmlformats.org/drawingml/2006/picture">
+                <pic:pic xmlns:pic="http://schemas.openxmlformats.org/drawingml/2006/picture">
+                  <pic:nvPicPr>
+                    <pic:cNvPr id="1872645524" name=""/>
+                    <pic:cNvPicPr/>
+                  </pic:nvPicPr>
+                  <pic:blipFill>
+                    <a:blip r:embed="rId24"/>
+                    <a:stretch>
+                      <a:fillRect/>
+                    </a:stretch>
+                  </pic:blipFill>
+                  <pic:spPr>
+                    <a:xfrm>
+                      <a:off x="0" y="0"/>
+                      <a:ext cx="5731510" cy="3696335"/>
+                    </a:xfrm>
+                    <a:prstGeom prst="rect">
+                      <a:avLst/>
+                    </a:prstGeom>
+                  </pic:spPr>
+                </pic:pic>
+              </a:graphicData>
+            </a:graphic>
+          </wp:inline>
+        </w:drawing>
+      </w:r>
+    </w:p>
+    <w:p/>
+    <w:p>
       <w:r>
         <w:lastRenderedPageBreak/>
         <w:t>Command –</w:t>
@@ -3163,7 +3233,7 @@
                     <pic:cNvPicPr/>
                   </pic:nvPicPr>
                   <pic:blipFill>
-                    <a:blip r:embed="rId23"/>
+                    <a:blip r:embed="rId25"/>
                     <a:stretch>
                       <a:fillRect/>
                     </a:stretch>
@@ -3283,6 +3353,9 @@
     </w:p>
     <w:p>
       <w:r>
+        <w:rPr>
+          <w:noProof/>
+        </w:rPr>
         <w:drawing>
           <wp:inline distT="0" distB="0" distL="0" distR="0" wp14:anchorId="46DA7683" wp14:editId="5222D88D">
             <wp:extent cx="5731510" cy="1559560"/>
@@ -3299,7 +3372,7 @@
                     <pic:cNvPicPr/>
                   </pic:nvPicPr>
                   <pic:blipFill>
-                    <a:blip r:embed="rId24"/>
+                    <a:blip r:embed="rId26"/>
                     <a:stretch>
                       <a:fillRect/>
                     </a:stretch>

</xml_diff>